<commit_message>
Bo sung project 2 xong
</commit_message>
<xml_diff>
--- a/MosWord2019.WinForms/Projects/Word2019_P01/starter.docx
+++ b/MosWord2019.WinForms/Projects/Word2019_P01/starter.docx
@@ -1,6 +1,6 @@
 
 <file path=word/document.xml><?xml version="1.0" encoding="utf-8"?>
-<w:document xmlns:wpc="http://schemas.microsoft.com/office/word/2010/wordprocessingCanvas" xmlns:cx="http://schemas.microsoft.com/office/drawing/2014/chartex" xmlns:cx1="http://schemas.microsoft.com/office/drawing/2015/9/8/chartex" xmlns:cx2="http://schemas.microsoft.com/office/drawing/2015/10/21/chartex" xmlns:cx3="http://schemas.microsoft.com/office/drawing/2016/5/9/chartex" xmlns:cx4="http://schemas.microsoft.com/office/drawing/2016/5/10/chartex" xmlns:cx5="http://schemas.microsoft.com/office/drawing/2016/5/11/chartex" xmlns:cx6="http://schemas.microsoft.com/office/drawing/2016/5/12/chartex" xmlns:cx7="http://schemas.microsoft.com/office/drawing/2016/5/13/chartex" xmlns:cx8="http://schemas.microsoft.com/office/drawing/2016/5/14/chartex" xmlns:mc="http://schemas.openxmlformats.org/markup-compatibility/2006" xmlns:aink="http://schemas.microsoft.com/office/drawing/2016/ink" xmlns:am3d="http://schemas.microsoft.com/office/drawing/2017/model3d" xmlns:o="urn:schemas-microsoft-com:office:office" xmlns:oel="http://schemas.microsoft.com/office/2019/extlst" xmlns:r="http://schemas.openxmlformats.org/officeDocument/2006/relationships" xmlns:m="http://schemas.openxmlformats.org/officeDocument/2006/math" xmlns:v="urn:schemas-microsoft-com:vml" xmlns:wp14="http://schemas.microsoft.com/office/word/2010/wordprocessingDrawing" xmlns:wp="http://schemas.openxmlformats.org/drawingml/2006/wordprocessingDrawing" xmlns:w10="urn:schemas-microsoft-com:office:word" xmlns:w="http://schemas.openxmlformats.org/wordprocessingml/2006/main" xmlns:w14="http://schemas.microsoft.com/office/word/2010/wordml" xmlns:w15="http://schemas.microsoft.com/office/word/2012/wordml" xmlns:w16cex="http://schemas.microsoft.com/office/word/2018/wordml/cex" xmlns:w16cid="http://schemas.microsoft.com/office/word/2016/wordml/cid" xmlns:w16="http://schemas.microsoft.com/office/word/2018/wordml" xmlns:w16sdtdh="http://schemas.microsoft.com/office/word/2020/wordml/sdtdatahash" xmlns:w16se="http://schemas.microsoft.com/office/word/2015/wordml/symex" xmlns:wpg="http://schemas.microsoft.com/office/word/2010/wordprocessingGroup" xmlns:wpi="http://schemas.microsoft.com/office/word/2010/wordprocessingInk" xmlns:wne="http://schemas.microsoft.com/office/word/2006/wordml" xmlns:wps="http://schemas.microsoft.com/office/word/2010/wordprocessingShape" mc:Ignorable="w14 w15 w16se w16cid w16 w16cex w16sdtdh wp14">
+<w:document xmlns:wpc="http://schemas.microsoft.com/office/word/2010/wordprocessingCanvas" xmlns:cx="http://schemas.microsoft.com/office/drawing/2014/chartex" xmlns:cx1="http://schemas.microsoft.com/office/drawing/2015/9/8/chartex" xmlns:cx2="http://schemas.microsoft.com/office/drawing/2015/10/21/chartex" xmlns:cx3="http://schemas.microsoft.com/office/drawing/2016/5/9/chartex" xmlns:cx4="http://schemas.microsoft.com/office/drawing/2016/5/10/chartex" xmlns:cx5="http://schemas.microsoft.com/office/drawing/2016/5/11/chartex" xmlns:cx6="http://schemas.microsoft.com/office/drawing/2016/5/12/chartex" xmlns:cx7="http://schemas.microsoft.com/office/drawing/2016/5/13/chartex" xmlns:cx8="http://schemas.microsoft.com/office/drawing/2016/5/14/chartex" xmlns:mc="http://schemas.openxmlformats.org/markup-compatibility/2006" xmlns:aink="http://schemas.microsoft.com/office/drawing/2016/ink" xmlns:am3d="http://schemas.microsoft.com/office/drawing/2017/model3d" xmlns:o="urn:schemas-microsoft-com:office:office" xmlns:r="http://schemas.openxmlformats.org/officeDocument/2006/relationships" xmlns:m="http://schemas.openxmlformats.org/officeDocument/2006/math" xmlns:v="urn:schemas-microsoft-com:vml" xmlns:wp14="http://schemas.microsoft.com/office/word/2010/wordprocessingDrawing" xmlns:wp="http://schemas.openxmlformats.org/drawingml/2006/wordprocessingDrawing" xmlns:w10="urn:schemas-microsoft-com:office:word" xmlns:w="http://schemas.openxmlformats.org/wordprocessingml/2006/main" xmlns:w14="http://schemas.microsoft.com/office/word/2010/wordml" xmlns:w15="http://schemas.microsoft.com/office/word/2012/wordml" xmlns:w16cex="http://schemas.microsoft.com/office/word/2018/wordml/cex" xmlns:w16cid="http://schemas.microsoft.com/office/word/2016/wordml/cid" xmlns:w16="http://schemas.microsoft.com/office/word/2018/wordml" xmlns:w16sdtdh="http://schemas.microsoft.com/office/word/2020/wordml/sdtdatahash" xmlns:w16se="http://schemas.microsoft.com/office/word/2015/wordml/symex" xmlns:wpg="http://schemas.microsoft.com/office/word/2010/wordprocessingGroup" xmlns:wpi="http://schemas.microsoft.com/office/word/2010/wordprocessingInk" xmlns:wne="http://schemas.microsoft.com/office/word/2006/wordml" xmlns:wps="http://schemas.microsoft.com/office/word/2010/wordprocessingShape" mc:Ignorable="w14 w15 w16se w16cid w16 w16cex w16sdtdh wp14">
   <w:body>
     <w:p>
       <w:pPr>
@@ -66,17 +66,25 @@
           <w:noProof/>
         </w:rPr>
         <w:drawing>
-          <wp:anchor distT="0" distB="0" distL="114300" distR="114300" simplePos="0" relativeHeight="251662336" behindDoc="0" locked="0" layoutInCell="1" allowOverlap="1" wp14:anchorId="62B545D9" wp14:editId="6A8D3C58">
+          <wp:anchor distT="0" distB="0" distL="114300" distR="114300" simplePos="0" relativeHeight="251662336" behindDoc="1" locked="0" layoutInCell="1" allowOverlap="1" wp14:anchorId="62B545D9" wp14:editId="4521BED7">
             <wp:simplePos x="0" y="0"/>
             <wp:positionH relativeFrom="column">
-              <wp:posOffset>6261735</wp:posOffset>
+              <wp:posOffset>6263640</wp:posOffset>
             </wp:positionH>
             <wp:positionV relativeFrom="paragraph">
               <wp:posOffset>0</wp:posOffset>
             </wp:positionV>
             <wp:extent cx="2649855" cy="3706495"/>
             <wp:effectExtent l="0" t="0" r="0" b="8255"/>
-            <wp:wrapSquare wrapText="bothSides"/>
+            <wp:wrapTight wrapText="bothSides">
+              <wp:wrapPolygon edited="0">
+                <wp:start x="0" y="0"/>
+                <wp:lineTo x="0" y="21537"/>
+                <wp:lineTo x="21429" y="21537"/>
+                <wp:lineTo x="21429" y="0"/>
+                <wp:lineTo x="0" y="0"/>
+              </wp:wrapPolygon>
+            </wp:wrapTight>
             <wp:docPr id="7" name="Picture 7"/>
             <wp:cNvGraphicFramePr>
               <a:graphicFrameLocks xmlns:a="http://schemas.openxmlformats.org/drawingml/2006/main" noChangeAspect="1"/>
@@ -636,7 +644,7 @@
 </file>
 
 <file path=word/endnotes.xml><?xml version="1.0" encoding="utf-8"?>
-<w:endnotes xmlns:wpc="http://schemas.microsoft.com/office/word/2010/wordprocessingCanvas" xmlns:cx="http://schemas.microsoft.com/office/drawing/2014/chartex" xmlns:cx1="http://schemas.microsoft.com/office/drawing/2015/9/8/chartex" xmlns:cx2="http://schemas.microsoft.com/office/drawing/2015/10/21/chartex" xmlns:cx3="http://schemas.microsoft.com/office/drawing/2016/5/9/chartex" xmlns:cx4="http://schemas.microsoft.com/office/drawing/2016/5/10/chartex" xmlns:cx5="http://schemas.microsoft.com/office/drawing/2016/5/11/chartex" xmlns:cx6="http://schemas.microsoft.com/office/drawing/2016/5/12/chartex" xmlns:cx7="http://schemas.microsoft.com/office/drawing/2016/5/13/chartex" xmlns:cx8="http://schemas.microsoft.com/office/drawing/2016/5/14/chartex" xmlns:mc="http://schemas.openxmlformats.org/markup-compatibility/2006" xmlns:aink="http://schemas.microsoft.com/office/drawing/2016/ink" xmlns:am3d="http://schemas.microsoft.com/office/drawing/2017/model3d" xmlns:o="urn:schemas-microsoft-com:office:office" xmlns:oel="http://schemas.microsoft.com/office/2019/extlst" xmlns:r="http://schemas.openxmlformats.org/officeDocument/2006/relationships" xmlns:m="http://schemas.openxmlformats.org/officeDocument/2006/math" xmlns:v="urn:schemas-microsoft-com:vml" xmlns:wp14="http://schemas.microsoft.com/office/word/2010/wordprocessingDrawing" xmlns:wp="http://schemas.openxmlformats.org/drawingml/2006/wordprocessingDrawing" xmlns:w10="urn:schemas-microsoft-com:office:word" xmlns:w="http://schemas.openxmlformats.org/wordprocessingml/2006/main" xmlns:w14="http://schemas.microsoft.com/office/word/2010/wordml" xmlns:w15="http://schemas.microsoft.com/office/word/2012/wordml" xmlns:w16cex="http://schemas.microsoft.com/office/word/2018/wordml/cex" xmlns:w16cid="http://schemas.microsoft.com/office/word/2016/wordml/cid" xmlns:w16="http://schemas.microsoft.com/office/word/2018/wordml" xmlns:w16sdtdh="http://schemas.microsoft.com/office/word/2020/wordml/sdtdatahash" xmlns:w16se="http://schemas.microsoft.com/office/word/2015/wordml/symex" xmlns:wpg="http://schemas.microsoft.com/office/word/2010/wordprocessingGroup" xmlns:wpi="http://schemas.microsoft.com/office/word/2010/wordprocessingInk" xmlns:wne="http://schemas.microsoft.com/office/word/2006/wordml" xmlns:wps="http://schemas.microsoft.com/office/word/2010/wordprocessingShape" mc:Ignorable="w14 w15 w16se w16cid w16 w16cex w16sdtdh wp14">
+<w:endnotes xmlns:wpc="http://schemas.microsoft.com/office/word/2010/wordprocessingCanvas" xmlns:cx="http://schemas.microsoft.com/office/drawing/2014/chartex" xmlns:cx1="http://schemas.microsoft.com/office/drawing/2015/9/8/chartex" xmlns:cx2="http://schemas.microsoft.com/office/drawing/2015/10/21/chartex" xmlns:cx3="http://schemas.microsoft.com/office/drawing/2016/5/9/chartex" xmlns:cx4="http://schemas.microsoft.com/office/drawing/2016/5/10/chartex" xmlns:cx5="http://schemas.microsoft.com/office/drawing/2016/5/11/chartex" xmlns:cx6="http://schemas.microsoft.com/office/drawing/2016/5/12/chartex" xmlns:cx7="http://schemas.microsoft.com/office/drawing/2016/5/13/chartex" xmlns:cx8="http://schemas.microsoft.com/office/drawing/2016/5/14/chartex" xmlns:mc="http://schemas.openxmlformats.org/markup-compatibility/2006" xmlns:aink="http://schemas.microsoft.com/office/drawing/2016/ink" xmlns:am3d="http://schemas.microsoft.com/office/drawing/2017/model3d" xmlns:o="urn:schemas-microsoft-com:office:office" xmlns:r="http://schemas.openxmlformats.org/officeDocument/2006/relationships" xmlns:m="http://schemas.openxmlformats.org/officeDocument/2006/math" xmlns:v="urn:schemas-microsoft-com:vml" xmlns:wp14="http://schemas.microsoft.com/office/word/2010/wordprocessingDrawing" xmlns:wp="http://schemas.openxmlformats.org/drawingml/2006/wordprocessingDrawing" xmlns:w10="urn:schemas-microsoft-com:office:word" xmlns:w="http://schemas.openxmlformats.org/wordprocessingml/2006/main" xmlns:w14="http://schemas.microsoft.com/office/word/2010/wordml" xmlns:w15="http://schemas.microsoft.com/office/word/2012/wordml" xmlns:w16cex="http://schemas.microsoft.com/office/word/2018/wordml/cex" xmlns:w16cid="http://schemas.microsoft.com/office/word/2016/wordml/cid" xmlns:w16="http://schemas.microsoft.com/office/word/2018/wordml" xmlns:w16sdtdh="http://schemas.microsoft.com/office/word/2020/wordml/sdtdatahash" xmlns:w16se="http://schemas.microsoft.com/office/word/2015/wordml/symex" xmlns:wpg="http://schemas.microsoft.com/office/word/2010/wordprocessingGroup" xmlns:wpi="http://schemas.microsoft.com/office/word/2010/wordprocessingInk" xmlns:wne="http://schemas.microsoft.com/office/word/2006/wordml" xmlns:wps="http://schemas.microsoft.com/office/word/2010/wordprocessingShape" mc:Ignorable="w14 w15 w16se w16cid w16 w16cex w16sdtdh wp14">
   <w:endnote w:type="separator" w:id="-1">
     <w:p>
       <w:pPr>
@@ -661,7 +669,7 @@
 </file>
 
 <file path=word/footnotes.xml><?xml version="1.0" encoding="utf-8"?>
-<w:footnotes xmlns:wpc="http://schemas.microsoft.com/office/word/2010/wordprocessingCanvas" xmlns:cx="http://schemas.microsoft.com/office/drawing/2014/chartex" xmlns:cx1="http://schemas.microsoft.com/office/drawing/2015/9/8/chartex" xmlns:cx2="http://schemas.microsoft.com/office/drawing/2015/10/21/chartex" xmlns:cx3="http://schemas.microsoft.com/office/drawing/2016/5/9/chartex" xmlns:cx4="http://schemas.microsoft.com/office/drawing/2016/5/10/chartex" xmlns:cx5="http://schemas.microsoft.com/office/drawing/2016/5/11/chartex" xmlns:cx6="http://schemas.microsoft.com/office/drawing/2016/5/12/chartex" xmlns:cx7="http://schemas.microsoft.com/office/drawing/2016/5/13/chartex" xmlns:cx8="http://schemas.microsoft.com/office/drawing/2016/5/14/chartex" xmlns:mc="http://schemas.openxmlformats.org/markup-compatibility/2006" xmlns:aink="http://schemas.microsoft.com/office/drawing/2016/ink" xmlns:am3d="http://schemas.microsoft.com/office/drawing/2017/model3d" xmlns:o="urn:schemas-microsoft-com:office:office" xmlns:oel="http://schemas.microsoft.com/office/2019/extlst" xmlns:r="http://schemas.openxmlformats.org/officeDocument/2006/relationships" xmlns:m="http://schemas.openxmlformats.org/officeDocument/2006/math" xmlns:v="urn:schemas-microsoft-com:vml" xmlns:wp14="http://schemas.microsoft.com/office/word/2010/wordprocessingDrawing" xmlns:wp="http://schemas.openxmlformats.org/drawingml/2006/wordprocessingDrawing" xmlns:w10="urn:schemas-microsoft-com:office:word" xmlns:w="http://schemas.openxmlformats.org/wordprocessingml/2006/main" xmlns:w14="http://schemas.microsoft.com/office/word/2010/wordml" xmlns:w15="http://schemas.microsoft.com/office/word/2012/wordml" xmlns:w16cex="http://schemas.microsoft.com/office/word/2018/wordml/cex" xmlns:w16cid="http://schemas.microsoft.com/office/word/2016/wordml/cid" xmlns:w16="http://schemas.microsoft.com/office/word/2018/wordml" xmlns:w16sdtdh="http://schemas.microsoft.com/office/word/2020/wordml/sdtdatahash" xmlns:w16se="http://schemas.microsoft.com/office/word/2015/wordml/symex" xmlns:wpg="http://schemas.microsoft.com/office/word/2010/wordprocessingGroup" xmlns:wpi="http://schemas.microsoft.com/office/word/2010/wordprocessingInk" xmlns:wne="http://schemas.microsoft.com/office/word/2006/wordml" xmlns:wps="http://schemas.microsoft.com/office/word/2010/wordprocessingShape" mc:Ignorable="w14 w15 w16se w16cid w16 w16cex w16sdtdh wp14">
+<w:footnotes xmlns:wpc="http://schemas.microsoft.com/office/word/2010/wordprocessingCanvas" xmlns:cx="http://schemas.microsoft.com/office/drawing/2014/chartex" xmlns:cx1="http://schemas.microsoft.com/office/drawing/2015/9/8/chartex" xmlns:cx2="http://schemas.microsoft.com/office/drawing/2015/10/21/chartex" xmlns:cx3="http://schemas.microsoft.com/office/drawing/2016/5/9/chartex" xmlns:cx4="http://schemas.microsoft.com/office/drawing/2016/5/10/chartex" xmlns:cx5="http://schemas.microsoft.com/office/drawing/2016/5/11/chartex" xmlns:cx6="http://schemas.microsoft.com/office/drawing/2016/5/12/chartex" xmlns:cx7="http://schemas.microsoft.com/office/drawing/2016/5/13/chartex" xmlns:cx8="http://schemas.microsoft.com/office/drawing/2016/5/14/chartex" xmlns:mc="http://schemas.openxmlformats.org/markup-compatibility/2006" xmlns:aink="http://schemas.microsoft.com/office/drawing/2016/ink" xmlns:am3d="http://schemas.microsoft.com/office/drawing/2017/model3d" xmlns:o="urn:schemas-microsoft-com:office:office" xmlns:r="http://schemas.openxmlformats.org/officeDocument/2006/relationships" xmlns:m="http://schemas.openxmlformats.org/officeDocument/2006/math" xmlns:v="urn:schemas-microsoft-com:vml" xmlns:wp14="http://schemas.microsoft.com/office/word/2010/wordprocessingDrawing" xmlns:wp="http://schemas.openxmlformats.org/drawingml/2006/wordprocessingDrawing" xmlns:w10="urn:schemas-microsoft-com:office:word" xmlns:w="http://schemas.openxmlformats.org/wordprocessingml/2006/main" xmlns:w14="http://schemas.microsoft.com/office/word/2010/wordml" xmlns:w15="http://schemas.microsoft.com/office/word/2012/wordml" xmlns:w16cex="http://schemas.microsoft.com/office/word/2018/wordml/cex" xmlns:w16cid="http://schemas.microsoft.com/office/word/2016/wordml/cid" xmlns:w16="http://schemas.microsoft.com/office/word/2018/wordml" xmlns:w16sdtdh="http://schemas.microsoft.com/office/word/2020/wordml/sdtdatahash" xmlns:w16se="http://schemas.microsoft.com/office/word/2015/wordml/symex" xmlns:wpg="http://schemas.microsoft.com/office/word/2010/wordprocessingGroup" xmlns:wpi="http://schemas.microsoft.com/office/word/2010/wordprocessingInk" xmlns:wne="http://schemas.microsoft.com/office/word/2006/wordml" xmlns:wps="http://schemas.microsoft.com/office/word/2010/wordprocessingShape" mc:Ignorable="w14 w15 w16se w16cid w16 w16cex w16sdtdh wp14">
   <w:footnote w:type="separator" w:id="-1">
     <w:p>
       <w:pPr>
@@ -686,7 +694,7 @@
 </file>
 
 <file path=word/numbering.xml><?xml version="1.0" encoding="utf-8"?>
-<w:numbering xmlns:wpc="http://schemas.microsoft.com/office/word/2010/wordprocessingCanvas" xmlns:cx="http://schemas.microsoft.com/office/drawing/2014/chartex" xmlns:cx1="http://schemas.microsoft.com/office/drawing/2015/9/8/chartex" xmlns:cx2="http://schemas.microsoft.com/office/drawing/2015/10/21/chartex" xmlns:cx3="http://schemas.microsoft.com/office/drawing/2016/5/9/chartex" xmlns:cx4="http://schemas.microsoft.com/office/drawing/2016/5/10/chartex" xmlns:cx5="http://schemas.microsoft.com/office/drawing/2016/5/11/chartex" xmlns:cx6="http://schemas.microsoft.com/office/drawing/2016/5/12/chartex" xmlns:cx7="http://schemas.microsoft.com/office/drawing/2016/5/13/chartex" xmlns:cx8="http://schemas.microsoft.com/office/drawing/2016/5/14/chartex" xmlns:mc="http://schemas.openxmlformats.org/markup-compatibility/2006" xmlns:aink="http://schemas.microsoft.com/office/drawing/2016/ink" xmlns:am3d="http://schemas.microsoft.com/office/drawing/2017/model3d" xmlns:o="urn:schemas-microsoft-com:office:office" xmlns:oel="http://schemas.microsoft.com/office/2019/extlst" xmlns:r="http://schemas.openxmlformats.org/officeDocument/2006/relationships" xmlns:m="http://schemas.openxmlformats.org/officeDocument/2006/math" xmlns:v="urn:schemas-microsoft-com:vml" xmlns:wp14="http://schemas.microsoft.com/office/word/2010/wordprocessingDrawing" xmlns:wp="http://schemas.openxmlformats.org/drawingml/2006/wordprocessingDrawing" xmlns:w10="urn:schemas-microsoft-com:office:word" xmlns:w="http://schemas.openxmlformats.org/wordprocessingml/2006/main" xmlns:w14="http://schemas.microsoft.com/office/word/2010/wordml" xmlns:w15="http://schemas.microsoft.com/office/word/2012/wordml" xmlns:w16cex="http://schemas.microsoft.com/office/word/2018/wordml/cex" xmlns:w16cid="http://schemas.microsoft.com/office/word/2016/wordml/cid" xmlns:w16="http://schemas.microsoft.com/office/word/2018/wordml" xmlns:w16sdtdh="http://schemas.microsoft.com/office/word/2020/wordml/sdtdatahash" xmlns:w16se="http://schemas.microsoft.com/office/word/2015/wordml/symex" xmlns:wpg="http://schemas.microsoft.com/office/word/2010/wordprocessingGroup" xmlns:wpi="http://schemas.microsoft.com/office/word/2010/wordprocessingInk" xmlns:wne="http://schemas.microsoft.com/office/word/2006/wordml" xmlns:wps="http://schemas.microsoft.com/office/word/2010/wordprocessingShape" mc:Ignorable="w14 w15 w16se w16cid w16 w16cex w16sdtdh wp14">
+<w:numbering xmlns:wpc="http://schemas.microsoft.com/office/word/2010/wordprocessingCanvas" xmlns:cx="http://schemas.microsoft.com/office/drawing/2014/chartex" xmlns:cx1="http://schemas.microsoft.com/office/drawing/2015/9/8/chartex" xmlns:cx2="http://schemas.microsoft.com/office/drawing/2015/10/21/chartex" xmlns:cx3="http://schemas.microsoft.com/office/drawing/2016/5/9/chartex" xmlns:cx4="http://schemas.microsoft.com/office/drawing/2016/5/10/chartex" xmlns:cx5="http://schemas.microsoft.com/office/drawing/2016/5/11/chartex" xmlns:cx6="http://schemas.microsoft.com/office/drawing/2016/5/12/chartex" xmlns:cx7="http://schemas.microsoft.com/office/drawing/2016/5/13/chartex" xmlns:cx8="http://schemas.microsoft.com/office/drawing/2016/5/14/chartex" xmlns:mc="http://schemas.openxmlformats.org/markup-compatibility/2006" xmlns:aink="http://schemas.microsoft.com/office/drawing/2016/ink" xmlns:am3d="http://schemas.microsoft.com/office/drawing/2017/model3d" xmlns:o="urn:schemas-microsoft-com:office:office" xmlns:r="http://schemas.openxmlformats.org/officeDocument/2006/relationships" xmlns:m="http://schemas.openxmlformats.org/officeDocument/2006/math" xmlns:v="urn:schemas-microsoft-com:vml" xmlns:wp14="http://schemas.microsoft.com/office/word/2010/wordprocessingDrawing" xmlns:wp="http://schemas.openxmlformats.org/drawingml/2006/wordprocessingDrawing" xmlns:w10="urn:schemas-microsoft-com:office:word" xmlns:w="http://schemas.openxmlformats.org/wordprocessingml/2006/main" xmlns:w14="http://schemas.microsoft.com/office/word/2010/wordml" xmlns:w15="http://schemas.microsoft.com/office/word/2012/wordml" xmlns:w16cex="http://schemas.microsoft.com/office/word/2018/wordml/cex" xmlns:w16cid="http://schemas.microsoft.com/office/word/2016/wordml/cid" xmlns:w16="http://schemas.microsoft.com/office/word/2018/wordml" xmlns:w16sdtdh="http://schemas.microsoft.com/office/word/2020/wordml/sdtdatahash" xmlns:w16se="http://schemas.microsoft.com/office/word/2015/wordml/symex" xmlns:wpg="http://schemas.microsoft.com/office/word/2010/wordprocessingGroup" xmlns:wpi="http://schemas.microsoft.com/office/word/2010/wordprocessingInk" xmlns:wne="http://schemas.microsoft.com/office/word/2006/wordml" xmlns:wps="http://schemas.microsoft.com/office/word/2010/wordprocessingShape" mc:Ignorable="w14 w15 w16se w16cid w16 w16cex w16sdtdh wp14">
   <w:numPicBullet w:numPicBulletId="0">
     <w:pict>
       <v:shapetype id="_x0000_t75" coordsize="21600,21600" o:spt="75" o:preferrelative="t" path="m@4@5l@4@11@9@11@9@5xe" filled="f" stroked="f">
@@ -708,7 +716,7 @@
         <v:path o:extrusionok="f" gradientshapeok="t" o:connecttype="rect"/>
         <o:lock v:ext="edit" aspectratio="t"/>
       </v:shapetype>
-      <v:shape id="_x0000_i1089" type="#_x0000_t75" style="width:120pt;height:120pt" o:bullet="t">
+      <v:shape id="_x0000_i1036" type="#_x0000_t75" style="width:120pt;height:120pt" o:bullet="t">
         <v:imagedata r:id="rId1" o:title="avatar"/>
       </v:shape>
     </w:pict>
@@ -3199,68 +3207,68 @@
       </w:rPr>
     </w:lvl>
   </w:abstractNum>
-  <w:num w:numId="1" w16cid:durableId="1213423569">
+  <w:num w:numId="1">
     <w:abstractNumId w:val="5"/>
   </w:num>
-  <w:num w:numId="2" w16cid:durableId="1885167362">
+  <w:num w:numId="2">
     <w:abstractNumId w:val="18"/>
   </w:num>
-  <w:num w:numId="3" w16cid:durableId="978151706">
+  <w:num w:numId="3">
     <w:abstractNumId w:val="9"/>
   </w:num>
-  <w:num w:numId="4" w16cid:durableId="724915790">
+  <w:num w:numId="4">
     <w:abstractNumId w:val="13"/>
   </w:num>
-  <w:num w:numId="5" w16cid:durableId="1440223316">
+  <w:num w:numId="5">
     <w:abstractNumId w:val="7"/>
   </w:num>
-  <w:num w:numId="6" w16cid:durableId="71514030">
+  <w:num w:numId="6">
     <w:abstractNumId w:val="8"/>
   </w:num>
-  <w:num w:numId="7" w16cid:durableId="16396931">
+  <w:num w:numId="7">
     <w:abstractNumId w:val="17"/>
   </w:num>
-  <w:num w:numId="8" w16cid:durableId="506748932">
+  <w:num w:numId="8">
     <w:abstractNumId w:val="15"/>
   </w:num>
-  <w:num w:numId="9" w16cid:durableId="312295535">
+  <w:num w:numId="9">
     <w:abstractNumId w:val="4"/>
   </w:num>
-  <w:num w:numId="10" w16cid:durableId="1733427358">
+  <w:num w:numId="10">
     <w:abstractNumId w:val="0"/>
   </w:num>
-  <w:num w:numId="11" w16cid:durableId="427891084">
+  <w:num w:numId="11">
     <w:abstractNumId w:val="11"/>
   </w:num>
-  <w:num w:numId="12" w16cid:durableId="1035811131">
+  <w:num w:numId="12">
     <w:abstractNumId w:val="12"/>
   </w:num>
-  <w:num w:numId="13" w16cid:durableId="2092239833">
+  <w:num w:numId="13">
     <w:abstractNumId w:val="6"/>
   </w:num>
-  <w:num w:numId="14" w16cid:durableId="938223991">
+  <w:num w:numId="14">
     <w:abstractNumId w:val="2"/>
   </w:num>
-  <w:num w:numId="15" w16cid:durableId="921063841">
+  <w:num w:numId="15">
     <w:abstractNumId w:val="1"/>
   </w:num>
-  <w:num w:numId="16" w16cid:durableId="1500578825">
+  <w:num w:numId="16">
     <w:abstractNumId w:val="3"/>
   </w:num>
-  <w:num w:numId="17" w16cid:durableId="103547734">
+  <w:num w:numId="17">
     <w:abstractNumId w:val="14"/>
   </w:num>
-  <w:num w:numId="18" w16cid:durableId="1339116260">
+  <w:num w:numId="18">
     <w:abstractNumId w:val="10"/>
   </w:num>
-  <w:num w:numId="19" w16cid:durableId="987705836">
+  <w:num w:numId="19">
     <w:abstractNumId w:val="16"/>
   </w:num>
 </w:numbering>
 </file>
 
 <file path=word/people.xml><?xml version="1.0" encoding="utf-8"?>
-<w15:people xmlns:wpc="http://schemas.microsoft.com/office/word/2010/wordprocessingCanvas" xmlns:cx="http://schemas.microsoft.com/office/drawing/2014/chartex" xmlns:cx1="http://schemas.microsoft.com/office/drawing/2015/9/8/chartex" xmlns:cx2="http://schemas.microsoft.com/office/drawing/2015/10/21/chartex" xmlns:cx3="http://schemas.microsoft.com/office/drawing/2016/5/9/chartex" xmlns:cx4="http://schemas.microsoft.com/office/drawing/2016/5/10/chartex" xmlns:cx5="http://schemas.microsoft.com/office/drawing/2016/5/11/chartex" xmlns:cx6="http://schemas.microsoft.com/office/drawing/2016/5/12/chartex" xmlns:cx7="http://schemas.microsoft.com/office/drawing/2016/5/13/chartex" xmlns:cx8="http://schemas.microsoft.com/office/drawing/2016/5/14/chartex" xmlns:mc="http://schemas.openxmlformats.org/markup-compatibility/2006" xmlns:aink="http://schemas.microsoft.com/office/drawing/2016/ink" xmlns:am3d="http://schemas.microsoft.com/office/drawing/2017/model3d" xmlns:o="urn:schemas-microsoft-com:office:office" xmlns:oel="http://schemas.microsoft.com/office/2019/extlst" xmlns:r="http://schemas.openxmlformats.org/officeDocument/2006/relationships" xmlns:m="http://schemas.openxmlformats.org/officeDocument/2006/math" xmlns:v="urn:schemas-microsoft-com:vml" xmlns:wp14="http://schemas.microsoft.com/office/word/2010/wordprocessingDrawing" xmlns:wp="http://schemas.openxmlformats.org/drawingml/2006/wordprocessingDrawing" xmlns:w10="urn:schemas-microsoft-com:office:word" xmlns:w="http://schemas.openxmlformats.org/wordprocessingml/2006/main" xmlns:w14="http://schemas.microsoft.com/office/word/2010/wordml" xmlns:w15="http://schemas.microsoft.com/office/word/2012/wordml" xmlns:w16cex="http://schemas.microsoft.com/office/word/2018/wordml/cex" xmlns:w16cid="http://schemas.microsoft.com/office/word/2016/wordml/cid" xmlns:w16="http://schemas.microsoft.com/office/word/2018/wordml" xmlns:w16sdtdh="http://schemas.microsoft.com/office/word/2020/wordml/sdtdatahash" xmlns:w16se="http://schemas.microsoft.com/office/word/2015/wordml/symex" xmlns:wpg="http://schemas.microsoft.com/office/word/2010/wordprocessingGroup" xmlns:wpi="http://schemas.microsoft.com/office/word/2010/wordprocessingInk" xmlns:wne="http://schemas.microsoft.com/office/word/2006/wordml" xmlns:wps="http://schemas.microsoft.com/office/word/2010/wordprocessingShape" mc:Ignorable="w14 w15 w16se w16cid w16 w16cex w16sdtdh wp14">
+<w15:people xmlns:wpc="http://schemas.microsoft.com/office/word/2010/wordprocessingCanvas" xmlns:cx="http://schemas.microsoft.com/office/drawing/2014/chartex" xmlns:cx1="http://schemas.microsoft.com/office/drawing/2015/9/8/chartex" xmlns:cx2="http://schemas.microsoft.com/office/drawing/2015/10/21/chartex" xmlns:cx3="http://schemas.microsoft.com/office/drawing/2016/5/9/chartex" xmlns:cx4="http://schemas.microsoft.com/office/drawing/2016/5/10/chartex" xmlns:cx5="http://schemas.microsoft.com/office/drawing/2016/5/11/chartex" xmlns:cx6="http://schemas.microsoft.com/office/drawing/2016/5/12/chartex" xmlns:cx7="http://schemas.microsoft.com/office/drawing/2016/5/13/chartex" xmlns:cx8="http://schemas.microsoft.com/office/drawing/2016/5/14/chartex" xmlns:mc="http://schemas.openxmlformats.org/markup-compatibility/2006" xmlns:aink="http://schemas.microsoft.com/office/drawing/2016/ink" xmlns:am3d="http://schemas.microsoft.com/office/drawing/2017/model3d" xmlns:o="urn:schemas-microsoft-com:office:office" xmlns:r="http://schemas.openxmlformats.org/officeDocument/2006/relationships" xmlns:m="http://schemas.openxmlformats.org/officeDocument/2006/math" xmlns:v="urn:schemas-microsoft-com:vml" xmlns:wp14="http://schemas.microsoft.com/office/word/2010/wordprocessingDrawing" xmlns:wp="http://schemas.openxmlformats.org/drawingml/2006/wordprocessingDrawing" xmlns:w10="urn:schemas-microsoft-com:office:word" xmlns:w="http://schemas.openxmlformats.org/wordprocessingml/2006/main" xmlns:w14="http://schemas.microsoft.com/office/word/2010/wordml" xmlns:w15="http://schemas.microsoft.com/office/word/2012/wordml" xmlns:w16cex="http://schemas.microsoft.com/office/word/2018/wordml/cex" xmlns:w16cid="http://schemas.microsoft.com/office/word/2016/wordml/cid" xmlns:w16="http://schemas.microsoft.com/office/word/2018/wordml" xmlns:w16sdtdh="http://schemas.microsoft.com/office/word/2020/wordml/sdtdatahash" xmlns:w16se="http://schemas.microsoft.com/office/word/2015/wordml/symex" xmlns:wpg="http://schemas.microsoft.com/office/word/2010/wordprocessingGroup" xmlns:wpi="http://schemas.microsoft.com/office/word/2010/wordprocessingInk" xmlns:wne="http://schemas.microsoft.com/office/word/2006/wordml" xmlns:wps="http://schemas.microsoft.com/office/word/2010/wordprocessingShape" mc:Ignorable="w14 w15 w16se w16cid w16 w16cex w16sdtdh wp14">
   <w15:person w15:author="LY TRAN THAI HOC">
     <w15:presenceInfo w15:providerId="Windows Live" w15:userId="d10502daab8e1f5f"/>
   </w15:person>

</xml_diff>